<commit_message>
Changed my status in planning doc
</commit_message>
<xml_diff>
--- a/Planning.docx
+++ b/Planning.docx
@@ -270,6 +270,113 @@
           <w:szCs w:val="28"/>
         </w:rPr>
       </w:pPr>
+    </w:p>
+    <w:p>
+      <w:pPr>
+        <w:rPr>
+          <w:rFonts w:ascii="Arial" w:hAnsi="Arial" w:cs="Arial"/>
+          <w:sz w:val="28"/>
+          <w:szCs w:val="28"/>
+        </w:rPr>
+      </w:pPr>
+    </w:p>
+    <w:p>
+      <w:pPr>
+        <w:rPr>
+          <w:rFonts w:ascii="Arial" w:hAnsi="Arial" w:cs="Arial"/>
+          <w:sz w:val="28"/>
+          <w:szCs w:val="28"/>
+        </w:rPr>
+      </w:pPr>
+    </w:p>
+    <w:p>
+      <w:pPr>
+        <w:rPr>
+          <w:rFonts w:ascii="Arial" w:hAnsi="Arial" w:cs="Arial"/>
+          <w:sz w:val="28"/>
+          <w:szCs w:val="28"/>
+        </w:rPr>
+      </w:pPr>
+    </w:p>
+    <w:p>
+      <w:pPr>
+        <w:rPr>
+          <w:rFonts w:ascii="Arial" w:hAnsi="Arial" w:cs="Arial"/>
+          <w:sz w:val="28"/>
+          <w:szCs w:val="28"/>
+        </w:rPr>
+      </w:pPr>
+    </w:p>
+    <w:p>
+      <w:pPr>
+        <w:rPr>
+          <w:rFonts w:ascii="Arial" w:hAnsi="Arial" w:cs="Arial"/>
+          <w:sz w:val="28"/>
+          <w:szCs w:val="28"/>
+        </w:rPr>
+      </w:pPr>
+    </w:p>
+    <w:p>
+      <w:pPr>
+        <w:rPr>
+          <w:rFonts w:ascii="Arial" w:hAnsi="Arial" w:cs="Arial"/>
+          <w:sz w:val="28"/>
+          <w:szCs w:val="28"/>
+        </w:rPr>
+      </w:pPr>
+    </w:p>
+    <w:p>
+      <w:pPr>
+        <w:rPr>
+          <w:rFonts w:ascii="Arial" w:hAnsi="Arial" w:cs="Arial"/>
+          <w:sz w:val="28"/>
+          <w:szCs w:val="28"/>
+        </w:rPr>
+      </w:pPr>
+    </w:p>
+    <w:p>
+      <w:pPr>
+        <w:rPr>
+          <w:rFonts w:ascii="Arial" w:hAnsi="Arial" w:cs="Arial"/>
+          <w:sz w:val="28"/>
+          <w:szCs w:val="28"/>
+        </w:rPr>
+      </w:pPr>
+    </w:p>
+    <w:p>
+      <w:pPr>
+        <w:rPr>
+          <w:rFonts w:ascii="Arial" w:hAnsi="Arial" w:cs="Arial"/>
+          <w:sz w:val="28"/>
+          <w:szCs w:val="28"/>
+        </w:rPr>
+      </w:pPr>
+      <w:r>
+        <w:rPr>
+          <w:rFonts w:ascii="Arial" w:hAnsi="Arial" w:cs="Arial"/>
+          <w:sz w:val="28"/>
+          <w:szCs w:val="28"/>
+        </w:rPr>
+        <w:lastRenderedPageBreak/>
+        <w:t>Development Plans</w:t>
+      </w:r>
+    </w:p>
+    <w:p>
+      <w:pPr>
+        <w:rPr>
+          <w:rFonts w:ascii="Arial" w:hAnsi="Arial" w:cs="Arial"/>
+          <w:sz w:val="28"/>
+          <w:szCs w:val="28"/>
+        </w:rPr>
+      </w:pPr>
+      <w:r>
+        <w:rPr>
+          <w:rFonts w:ascii="Arial" w:hAnsi="Arial" w:cs="Arial"/>
+          <w:sz w:val="28"/>
+          <w:szCs w:val="28"/>
+        </w:rPr>
+        <w:t>Leivi: Working on using and throwing items with the inventory system.</w:t>
+      </w:r>
     </w:p>
     <w:sectPr>
       <w:pgSz w:w="11906" w:h="16838"/>

</xml_diff>

<commit_message>
new items to list
</commit_message>
<xml_diff>
--- a/Planning.docx
+++ b/Planning.docx
@@ -29,6 +29,120 @@
       <w:pPr>
         <w:rPr>
           <w:rFonts w:ascii="Arial" w:hAnsi="Arial" w:cs="Arial"/>
+          <w:sz w:val="32"/>
+          <w:szCs w:val="32"/>
+        </w:rPr>
+      </w:pPr>
+      <w:r>
+        <w:rPr>
+          <w:rFonts w:ascii="Arial" w:hAnsi="Arial" w:cs="Arial"/>
+          <w:sz w:val="32"/>
+          <w:szCs w:val="32"/>
+        </w:rPr>
+        <w:t>Leivi, Saqif, Alex, John, Mohammed</w:t>
+      </w:r>
+    </w:p>
+    <w:p>
+      <w:pPr>
+        <w:rPr>
+          <w:rFonts w:ascii="Arial" w:hAnsi="Arial" w:cs="Arial"/>
+          <w:sz w:val="32"/>
+          <w:szCs w:val="32"/>
+        </w:rPr>
+      </w:pPr>
+    </w:p>
+    <w:p>
+      <w:pPr>
+        <w:rPr>
+          <w:rFonts w:ascii="Arial" w:hAnsi="Arial" w:cs="Arial"/>
+          <w:sz w:val="32"/>
+          <w:szCs w:val="32"/>
+        </w:rPr>
+      </w:pPr>
+      <w:r>
+        <w:rPr>
+          <w:rFonts w:ascii="Arial" w:hAnsi="Arial" w:cs="Arial"/>
+          <w:b/>
+          <w:bCs/>
+          <w:sz w:val="32"/>
+          <w:szCs w:val="32"/>
+          <w:u w:val="single"/>
+        </w:rPr>
+        <w:t>Item List (exact)</w:t>
+      </w:r>
+    </w:p>
+    <w:p>
+      <w:pPr>
+        <w:rPr>
+          <w:rFonts w:ascii="Arial" w:hAnsi="Arial" w:cs="Arial"/>
+          <w:sz w:val="32"/>
+          <w:szCs w:val="32"/>
+        </w:rPr>
+      </w:pPr>
+      <w:r>
+        <w:rPr>
+          <w:rFonts w:ascii="Arial" w:hAnsi="Arial" w:cs="Arial"/>
+          <w:sz w:val="32"/>
+          <w:szCs w:val="32"/>
+        </w:rPr>
+        <w:t>Healing Potion</w:t>
+      </w:r>
+    </w:p>
+    <w:p>
+      <w:pPr>
+        <w:rPr>
+          <w:rFonts w:ascii="Arial" w:hAnsi="Arial" w:cs="Arial"/>
+          <w:sz w:val="32"/>
+          <w:szCs w:val="32"/>
+        </w:rPr>
+      </w:pPr>
+      <w:r>
+        <w:rPr>
+          <w:rFonts w:ascii="Arial" w:hAnsi="Arial" w:cs="Arial"/>
+          <w:sz w:val="32"/>
+          <w:szCs w:val="32"/>
+        </w:rPr>
+        <w:t>Rusty Sword</w:t>
+      </w:r>
+    </w:p>
+    <w:p>
+      <w:pPr>
+        <w:rPr>
+          <w:rFonts w:ascii="Arial" w:hAnsi="Arial" w:cs="Arial"/>
+          <w:sz w:val="32"/>
+          <w:szCs w:val="32"/>
+        </w:rPr>
+      </w:pPr>
+      <w:r>
+        <w:rPr>
+          <w:rFonts w:ascii="Arial" w:hAnsi="Arial" w:cs="Arial"/>
+          <w:sz w:val="32"/>
+          <w:szCs w:val="32"/>
+        </w:rPr>
+        <w:t>Rusty Armour</w:t>
+      </w:r>
+    </w:p>
+    <w:p>
+      <w:pPr>
+        <w:rPr>
+          <w:rFonts w:ascii="Arial" w:hAnsi="Arial" w:cs="Arial"/>
+          <w:sz w:val="32"/>
+          <w:szCs w:val="32"/>
+        </w:rPr>
+      </w:pPr>
+      <w:r>
+        <w:rPr>
+          <w:rFonts w:ascii="Arial" w:hAnsi="Arial" w:cs="Arial"/>
+          <w:sz w:val="32"/>
+          <w:szCs w:val="32"/>
+        </w:rPr>
+        <w:t>Steel Sword</w:t>
+      </w:r>
+    </w:p>
+    <w:p>
+      <w:pPr>
+        <w:rPr>
+          <w:rFonts w:ascii="Arial" w:hAnsi="Arial" w:cs="Arial"/>
           <w:sz w:val="28"/>
           <w:szCs w:val="28"/>
         </w:rPr>
@@ -39,7 +153,7 @@
           <w:sz w:val="32"/>
           <w:szCs w:val="32"/>
         </w:rPr>
-        <w:t>Leivi, Saqif, Alex, John, Mohammed</w:t>
+        <w:t>Steel Armour</w:t>
       </w:r>
     </w:p>
     <w:sectPr>

</xml_diff>